<commit_message>
Release: pricing sections, Select Vendors + Markup lanes, selection is the price, proposal re-sends, reply manual quotes (0100-0105)
- 0100: gear/underground/low_voltage pricing sections with per-section
  markup, verify lines, per-GC overrides, and proposal stamps
- 0101/0102: 6-lane board; select_vendors and markup become their own
  lanes; quote approval on Receive Quotes
- 0103: the selected quote IS the price; manual and estimate candidates
  materialized as quote rows
- 0104: proposal_send_events for re-sends and late-GC sends; send window
  widened through bid_outcome
- 0105: reply-bound manual quote entry; project_files.rfq_message_id
- Trenching RFQs send markup + drawings instead of the counts split;
  Modify Files on RFQ and proposal sends

Co-Authored-By: Claude Fable 5 <noreply@anthropic.com>
</commit_message>
<xml_diff>
--- a/app/assets/proposal_template.docx
+++ b/app/assets/proposal_template.docx
@@ -2434,6 +2434,126 @@
             </w:pPr>
             <w:r>
               <w:t>&lt;Material Amount&gt;</w:t>
+            </w:r>
+          </w:p>
+        </w:tc>
+      </w:tr>
+      <w:tr>
+        <w:trPr>
+          <w:cantSplit/>
+        </w:trPr>
+        <w:tc>
+          <w:tcPr>
+            <w:tcW w:w="4306" w:type="dxa"/>
+            <w:shd w:val="clear" w:color="auto" w:fill="C5E0B3" w:themeFill="accent6" w:themeFillTint="66"/>
+          </w:tcPr>
+          <w:p>
+            <w:pPr>
+              <w:keepNext/>
+            </w:pPr>
+            <w:r>
+              <w:t xml:space="preserve">Gear and Power Distribution Equipment</w:t>
+            </w:r>
+          </w:p>
+          <w:p>
+            <w:pPr>
+              <w:keepNext/>
+              <w:rPr>
+                <w:i/>
+                <w:sz w:val="16"/>
+                <w:szCs w:val="16"/>
+              </w:rPr>
+            </w:pPr>
+            <w:r>
+              <w:rPr>
+                <w:i/>
+                <w:sz w:val="16"/>
+                <w:szCs w:val="16"/>
+              </w:rPr>
+              <w:t xml:space="preserve">*Includes Generator/s</w:t>
+            </w:r>
+          </w:p>
+        </w:tc>
+        <w:tc>
+          <w:tcPr>
+            <w:tcW w:w="2000" w:type="dxa"/>
+            <w:shd w:val="clear" w:color="auto" w:fill="C5E0B3" w:themeFill="accent6" w:themeFillTint="66"/>
+          </w:tcPr>
+          <w:p>
+            <w:pPr>
+              <w:keepNext/>
+              <w:jc w:val="right"/>
+            </w:pPr>
+            <w:r>
+              <w:t xml:space="preserve">&lt;Gear Amount&gt;</w:t>
+            </w:r>
+          </w:p>
+        </w:tc>
+      </w:tr>
+      <w:tr>
+        <w:trPr>
+          <w:cantSplit/>
+        </w:trPr>
+        <w:tc>
+          <w:tcPr>
+            <w:tcW w:w="4306" w:type="dxa"/>
+            <w:shd w:val="clear" w:color="auto" w:fill="C5E0B3" w:themeFill="accent6" w:themeFillTint="66"/>
+          </w:tcPr>
+          <w:p>
+            <w:pPr>
+              <w:keepNext/>
+            </w:pPr>
+            <w:r>
+              <w:t xml:space="preserve">Underground</w:t>
+            </w:r>
+          </w:p>
+        </w:tc>
+        <w:tc>
+          <w:tcPr>
+            <w:tcW w:w="2000" w:type="dxa"/>
+            <w:shd w:val="clear" w:color="auto" w:fill="C5E0B3" w:themeFill="accent6" w:themeFillTint="66"/>
+          </w:tcPr>
+          <w:p>
+            <w:pPr>
+              <w:keepNext/>
+              <w:jc w:val="right"/>
+            </w:pPr>
+            <w:r>
+              <w:t xml:space="preserve">&lt;Underground Amount&gt;</w:t>
+            </w:r>
+          </w:p>
+        </w:tc>
+      </w:tr>
+      <w:tr>
+        <w:trPr>
+          <w:cantSplit/>
+        </w:trPr>
+        <w:tc>
+          <w:tcPr>
+            <w:tcW w:w="4306" w:type="dxa"/>
+            <w:shd w:val="clear" w:color="auto" w:fill="C5E0B3" w:themeFill="accent6" w:themeFillTint="66"/>
+          </w:tcPr>
+          <w:p>
+            <w:pPr>
+              <w:keepNext/>
+            </w:pPr>
+            <w:r>
+              <w:t xml:space="preserve">Low Voltage</w:t>
+            </w:r>
+          </w:p>
+        </w:tc>
+        <w:tc>
+          <w:tcPr>
+            <w:tcW w:w="2000" w:type="dxa"/>
+            <w:shd w:val="clear" w:color="auto" w:fill="C5E0B3" w:themeFill="accent6" w:themeFillTint="66"/>
+          </w:tcPr>
+          <w:p>
+            <w:pPr>
+              <w:keepNext/>
+              <w:jc w:val="right"/>
+            </w:pPr>
+            <w:r>
+              <w:t xml:space="preserve">&lt;Low Voltage Amount&gt;</w:t>
             </w:r>
           </w:p>
         </w:tc>

</xml_diff>